<commit_message>
Add labels to chooser valuer
Update gitignore and devops docs
</commit_message>
<xml_diff>
--- a/PySupport/PyDevOps.docx
+++ b/PySupport/PyDevOps.docx
@@ -52,7 +52,13 @@
         <w:t xml:space="preserve"> application into services.</w:t>
       </w:r>
       <w:r>
-        <w:t xml:space="preserve"> I have to do this for both Java and Python applications.</w:t>
+        <w:t xml:space="preserve"> I </w:t>
+      </w:r>
+      <w:r>
+        <w:t>must</w:t>
+      </w:r>
+      <w:r>
+        <w:t xml:space="preserve"> do this for both Java and Python applications.</w:t>
       </w:r>
       <w:r>
         <w:t xml:space="preserve"> These considerations inform application architecture</w:t>
@@ -566,7 +572,23 @@
           <w:rFonts w:ascii="Consolas" w:hAnsi="Consolas"/>
           <w:color w:val="000090"/>
         </w:rPr>
-        <w:t>input_df = hdfs_readers[file_type](file_type, hdfs_file, hive_ctx)</w:t>
+        <w:t>input_df = hdfs_readers[file_</w:t>
+      </w:r>
+      <w:proofErr w:type="gramStart"/>
+      <w:r>
+        <w:rPr>
+          <w:rFonts w:ascii="Consolas" w:hAnsi="Consolas"/>
+          <w:color w:val="000090"/>
+        </w:rPr>
+        <w:t>type](</w:t>
+      </w:r>
+      <w:proofErr w:type="gramEnd"/>
+      <w:r>
+        <w:rPr>
+          <w:rFonts w:ascii="Consolas" w:hAnsi="Consolas"/>
+          <w:color w:val="000090"/>
+        </w:rPr>
+        <w:t>file_type, hdfs_file, hive_ctx)</w:t>
       </w:r>
     </w:p>
     <w:p/>
@@ -680,7 +702,15 @@
         <w:t xml:space="preserve">Azure note: </w:t>
       </w:r>
       <w:r>
-        <w:t>Functions integrates with BitBucket, Dropbox, GitHub, and Azure DevOps</w:t>
+        <w:t xml:space="preserve">Functions </w:t>
+      </w:r>
+      <w:proofErr w:type="gramStart"/>
+      <w:r>
+        <w:t>integrates</w:t>
+      </w:r>
+      <w:proofErr w:type="gramEnd"/>
+      <w:r>
+        <w:t xml:space="preserve"> with BitBucket, Dropbox, GitHub, and Azure DevOps</w:t>
       </w:r>
       <w:r>
         <w:t xml:space="preserve"> (see </w:t>
@@ -1876,6 +1906,8 @@
   </w:compat>
   <w:rsids>
     <w:rsidRoot w:val="00F80B7F"/>
+    <w:rsid w:val="001D54F6"/>
+    <w:rsid w:val="006C12B8"/>
     <w:rsid w:val="00750F6D"/>
     <w:rsid w:val="0075561B"/>
     <w:rsid w:val="00AF3DF8"/>

</xml_diff>